<commit_message>
fix: aplica template narrativo correto nas procurações dos novos advogados
8 pastas de advogados criadas recentemente tinham templates antigos
(formato OUTORGANTE/OUTORGADA) ou cópias genéricas do _padrao sem nome
do advogado. Substituídos pelo template narrativo personalizado com
nome, OAB e concordância de gênero corretos.

Co-Authored-By: Claude Sonnet 4.6 <noreply@anthropic.com>
</commit_message>
<xml_diff>
--- a/backend/modelos/henriquefmolyahoocombr12/modelo_procuracao_henriquefmolyahoocombr12.docx
+++ b/backend/modelos/henriquefmolyahoocombr12/modelo_procuracao_henriquefmolyahoocombr12.docx
@@ -83,39 +83,52 @@
         </w:rPr>
       </w:pPr>
       <w:r>
+        <w:t xml:space="preserve">Pelo presente instrumento de mandato, </w:t>
+      </w:r>
+      <w:r>
+        <w:t>{{ nome }}</w:t>
+      </w:r>
+      <w:r>
+        <w:t xml:space="preserve">, </w:t>
+      </w:r>
+      <w:r>
+        <w:t>{{ nacionalidade }}</w:t>
+      </w:r>
+      <w:r>
+        <w:t xml:space="preserve">, inscrito(a) no </w:t>
+      </w:r>
+      <w:r>
+        <w:t>{{tipo_documento}}</w:t>
+      </w:r>
+      <w:r>
+        <w:t xml:space="preserve"> sob o nº </w:t>
+      </w:r>
+      <w:r>
+        <w:t>{{ cpf }}</w:t>
+      </w:r>
+      <w:r>
+        <w:t xml:space="preserve">, residente e domiciliado(a) na </w:t>
+      </w:r>
+      <w:r>
+        <w:t>{{ endereco_cliente }}</w:t>
+      </w:r>
+      <w:r>
+        <w:t xml:space="preserve">, nomeia e constitui como seu procurador o advogado </w:t>
+      </w:r>
+      <w:r>
         <w:rPr>
-          <w:rFonts w:ascii="Aptos" w:hAnsi="Aptos"/>
-          <w:b w:val="0"/>
-        </w:rPr>
-        <w:t xml:space="preserve">Pelo presente instrumento de mandato, </w:t>
-      </w:r>
-      <w:r>
-        <w:rPr>
-          <w:rFonts w:ascii="Aptos" w:hAnsi="Aptos"/>
           <w:b/>
         </w:rPr>
-        <w:t>{{ nome }}</w:t>
-      </w:r>
-      <w:r>
-        <w:rPr>
-          <w:rFonts w:ascii="Aptos" w:hAnsi="Aptos"/>
-          <w:b w:val="0"/>
-        </w:rPr>
-        <w:t xml:space="preserve">, {{ nacionalidade }}, inscrito(a) no {{ tipo_documento }} sob o nº {{ cpf }}, residente e domiciliado(a) na {{ endereco_cliente }}, nomeia e constitui como seu(sua) procurador(a) o(a) Dr(a). </w:t>
-      </w:r>
-      <w:r>
-        <w:rPr>
-          <w:rFonts w:ascii="Aptos" w:hAnsi="Aptos"/>
-          <w:b/>
-        </w:rPr>
-        <w:t>{{ adv_nome }}</w:t>
-      </w:r>
-      <w:r>
-        <w:rPr>
-          <w:rFonts w:ascii="Aptos" w:hAnsi="Aptos"/>
-          <w:b w:val="0"/>
-        </w:rPr>
-        <w:t>, inscrito(a) na {{ adv_oab }}, outorgando-lhe os poderes contidos na cláusula "ad judicia", para ajuizar ação em face de {{ administradora }}, podendo, para tanto, requerer em juízo ou onde se apresentar, podendo ainda receber e dar quitação, substabelecer, nomear preposto, praticando, enfim, todos os atos necessários ou úteis ao bom desempenho deste mandato para o fim de representar o outorgante.</w:t>
+        <w:t>HERMESSON FERNANDES DE OLIVEIRA</w:t>
+      </w:r>
+      <w:r>
+        <w:t xml:space="preserve">, inscrito na OAB/MG sob o nº 231.745, outorgando-lhe os poderes contidos na cláusula "ad judicia", para ajuizar ação em face de </w:t>
+      </w:r>
+      <w:r>
+        <w:t>{{ administradora }}</w:t>
+      </w:r>
+      <w:r>
+        <w:t xml:space="preserve">, podendo, para tanto, requerer em juízo ou onde se apresentar, podendo ainda receber e dar quitação, substabelecer, nomear preposto, praticando, enfim, todos os atos necessários ou úteis ao bom desempenho deste mandato para o fim de representar o(a) outorgante. </w:t>
       </w:r>
     </w:p>
     <w:p>
@@ -185,11 +198,16 @@
         </w:rPr>
       </w:pPr>
       <w:r>
-        <w:rPr>
-          <w:rFonts w:ascii="Aptos" w:hAnsi="Aptos"/>
-          <w:sz w:val="24"/>
-        </w:rPr>
-        <w:t>{{ cidade_estado_cliente }}, {{ data_procuracao }}.</w:t>
+        <w:t>{{ cidade_estado_cliente }}</w:t>
+      </w:r>
+      <w:r>
+        <w:t xml:space="preserve">, </w:t>
+      </w:r>
+      <w:r>
+        <w:t>{{ data_procuracao }}</w:t>
+      </w:r>
+      <w:r>
+        <w:t>.</w:t>
       </w:r>
     </w:p>
     <w:p>
@@ -207,13 +225,6 @@
           <w:lang w:val="pt-BR"/>
         </w:rPr>
       </w:pPr>
-      <w:r>
-        <w:rPr>
-          <w:rFonts w:ascii="Aptos" w:hAnsi="Aptos"/>
-          <w:color w:val="FFFFFF"/>
-        </w:rPr>
-        <w:t>&lt;&lt;assinatura_cliente&gt;&gt;</w:t>
-      </w:r>
     </w:p>
     <w:p>
       <w:pPr>
@@ -230,11 +241,17 @@
           <w:lang w:val="pt-BR"/>
         </w:rPr>
       </w:pPr>
+    </w:p>
+    <w:p>
+      <w:pPr>
+        <w:pStyle w:val="ListParagraph"/>
+        <w:jc w:val="center"/>
+      </w:pPr>
       <w:r>
         <w:rPr>
-          <w:rFonts w:ascii="Aptos" w:hAnsi="Aptos"/>
+          <w:color w:val="FFFFFF"/>
         </w:rPr>
-        <w:t>________________________________________</w:t>
+        <w:t>&lt;&lt;assinatura_cliente&gt;&gt;</w:t>
       </w:r>
     </w:p>
     <w:p>
@@ -248,9 +265,7 @@
       </w:pPr>
       <w:r>
         <w:rPr>
-          <w:rFonts w:ascii="Aptos" w:hAnsi="Aptos"/>
           <w:b/>
-          <w:sz w:val="24"/>
         </w:rPr>
         <w:t>{{nome}}</w:t>
       </w:r>
@@ -281,9 +296,7 @@
       </w:pPr>
       <w:r>
         <w:rPr>
-          <w:rFonts w:ascii="Aptos" w:hAnsi="Aptos"/>
           <w:b/>
-          <w:sz w:val="24"/>
         </w:rPr>
         <w:t>{{tipo_documento}} {{cpf}}</w:t>
       </w:r>

</xml_diff>